<commit_message>
Update on 27 Jun 2025 at 15:04
</commit_message>
<xml_diff>
--- a/02_introduction_to_docx.docx
+++ b/02_introduction_to_docx.docx
@@ -1392,7 +1392,7 @@
         </w:rPr>
         <w:lastRenderedPageBreak/>
         <w:drawing>
-          <wp:inline distT="0" distB="0" distL="0" distR="0" wp14:anchorId="48292EAF" wp14:editId="22C0E58D">
+          <wp:inline distT="0" distB="0" distL="0" distR="0" wp14:anchorId="48292EAF" wp14:editId="3DFD482C">
             <wp:extent cx="5932806" cy="1155700"/>
             <wp:effectExtent l="0" t="0" r="0" b="6350"/>
             <wp:docPr id="23" name="Picture 23"/>
@@ -3561,6 +3561,9 @@
       </w:r>
     </w:p>
     <w:p>
+      <w:pPr>
+        <w:jc w:val="both"/>
+      </w:pPr>
       <w:r>
         <w:t xml:space="preserve">“##Source” field is </w:t>
       </w:r>
@@ -8069,13 +8072,7 @@
         <w:fldChar w:fldCharType="separate"/>
       </w:r>
       <w:r>
-        <w:t>Fig</w:t>
-      </w:r>
-      <w:r>
-        <w:t>u</w:t>
-      </w:r>
-      <w:r>
-        <w:t xml:space="preserve">re </w:t>
+        <w:t xml:space="preserve">Figure </w:t>
       </w:r>
       <w:r>
         <w:rPr>

</xml_diff>

<commit_message>
Update on 02 Jul 2025 at 15:09
</commit_message>
<xml_diff>
--- a/02_introduction_to_docx.docx
+++ b/02_introduction_to_docx.docx
@@ -826,6 +826,7 @@
     <w:p>
       <w:pPr>
         <w:pStyle w:val="BodyText"/>
+        <w:jc w:val="both"/>
       </w:pPr>
       <w:r>
         <w:t>When you choose a MS Word style, selected content will change its appearance in your  `.docx` file. Do not worry about it. MS Word styles will enable the system to correctly structure your work and display it in the final layout.</w:t>
@@ -1392,7 +1393,7 @@
         </w:rPr>
         <w:lastRenderedPageBreak/>
         <w:drawing>
-          <wp:inline distT="0" distB="0" distL="0" distR="0" wp14:anchorId="48292EAF" wp14:editId="3DFD482C">
+          <wp:inline distT="0" distB="0" distL="0" distR="0" wp14:anchorId="48292EAF" wp14:editId="50CD11F1">
             <wp:extent cx="5932806" cy="1155700"/>
             <wp:effectExtent l="0" t="0" r="0" b="6350"/>
             <wp:docPr id="23" name="Picture 23"/>
@@ -3144,6 +3145,9 @@
       </w:r>
     </w:p>
     <w:p>
+      <w:pPr>
+        <w:jc w:val="both"/>
+      </w:pPr>
       <w:r>
         <w:t>“</w:t>
       </w:r>
@@ -4603,6 +4607,7 @@
     <w:p>
       <w:pPr>
         <w:pStyle w:val="BodyText"/>
+        <w:jc w:val="both"/>
       </w:pPr>
       <w:r>
         <w:t xml:space="preserve">To enable a navigation to a different part of the same file, you have to cross-reference </w:t>

</xml_diff>